<commit_message>
Update 6 Apr 2026
</commit_message>
<xml_diff>
--- a/uprojects/John Ottolenghi/Sniffi_NDA.docx
+++ b/uprojects/John Ottolenghi/Sniffi_NDA.docx
@@ -188,7 +188,6 @@
         </w:rPr>
         <w:t xml:space="preserve"> </w:t>
       </w:r>
-      <w:proofErr w:type="gramStart"/>
       <w:r>
         <w:rPr>
           <w:b/>
@@ -197,18 +196,7 @@
           <w:sz w:val="24"/>
           <w:szCs w:val="24"/>
         </w:rPr>
-        <w:t>Savar ,</w:t>
-      </w:r>
-      <w:proofErr w:type="gramEnd"/>
-      <w:r>
-        <w:rPr>
-          <w:b/>
-          <w:bCs/>
-          <w:color w:val="000000"/>
-          <w:sz w:val="24"/>
-          <w:szCs w:val="24"/>
-        </w:rPr>
-        <w:t xml:space="preserve"> Dhaka 1330</w:t>
+        <w:t>Savar , Dhaka 1330</w:t>
       </w:r>
     </w:p>
     <w:p>
@@ -515,52 +503,6 @@
       <w:r>
         <w:t xml:space="preserve"> </w:t>
       </w:r>
-      <w:r>
-        <w:rPr>
-          <w:noProof/>
-        </w:rPr>
-        <w:drawing>
-          <wp:inline distT="0" distB="0" distL="0" distR="0" wp14:anchorId="3835F191" wp14:editId="468B559F">
-            <wp:extent cx="1581150" cy="563369"/>
-            <wp:effectExtent l="0" t="0" r="0" b="8255"/>
-            <wp:docPr id="961166709" name="Picture 1"/>
-            <wp:cNvGraphicFramePr>
-              <a:graphicFrameLocks xmlns:a="http://schemas.openxmlformats.org/drawingml/2006/main" noChangeAspect="1"/>
-            </wp:cNvGraphicFramePr>
-            <a:graphic xmlns:a="http://schemas.openxmlformats.org/drawingml/2006/main">
-              <a:graphicData uri="http://schemas.openxmlformats.org/drawingml/2006/picture">
-                <pic:pic xmlns:pic="http://schemas.openxmlformats.org/drawingml/2006/picture">
-                  <pic:nvPicPr>
-                    <pic:cNvPr id="961166709" name="Picture 961166709"/>
-                    <pic:cNvPicPr/>
-                  </pic:nvPicPr>
-                  <pic:blipFill>
-                    <a:blip r:embed="rId5" cstate="print">
-                      <a:extLst>
-                        <a:ext uri="{28A0092B-C50C-407E-A947-70E740481C1C}">
-                          <a14:useLocalDpi xmlns:a14="http://schemas.microsoft.com/office/drawing/2010/main" val="0"/>
-                        </a:ext>
-                      </a:extLst>
-                    </a:blip>
-                    <a:stretch>
-                      <a:fillRect/>
-                    </a:stretch>
-                  </pic:blipFill>
-                  <pic:spPr>
-                    <a:xfrm>
-                      <a:off x="0" y="0"/>
-                      <a:ext cx="1613099" cy="574753"/>
-                    </a:xfrm>
-                    <a:prstGeom prst="rect">
-                      <a:avLst/>
-                    </a:prstGeom>
-                  </pic:spPr>
-                </pic:pic>
-              </a:graphicData>
-            </a:graphic>
-          </wp:inline>
-        </w:drawing>
-      </w:r>
     </w:p>
     <w:p>
       <w:pPr>
@@ -615,15 +557,7 @@
       </w:r>
       <w:proofErr w:type="spellEnd"/>
       <w:r>
-        <w:t xml:space="preserve">, Bank Colony </w:t>
-      </w:r>
-      <w:proofErr w:type="gramStart"/>
-      <w:r>
-        <w:t>Savar ,</w:t>
-      </w:r>
-      <w:proofErr w:type="gramEnd"/>
-      <w:r>
-        <w:t xml:space="preserve"> Dhaka 1330</w:t>
+        <w:t>, Bank Colony Savar , Dhaka 1330</w:t>
       </w:r>
     </w:p>
     <w:p>
@@ -675,10 +609,7 @@
         <w:t>Upwork Profile URL:</w:t>
       </w:r>
       <w:r>
-        <w:t xml:space="preserve"> </w:t>
-      </w:r>
-      <w:r>
-        <w:t>https://www.upwork.com/freelancers/khandokermohdmazidulhaque</w:t>
+        <w:t xml:space="preserve"> https://www.upwork.com/freelancers/khandokermohdmazidulhaque</w:t>
       </w:r>
     </w:p>
     <w:p>
@@ -692,25 +623,7 @@
           <w:sz w:val="18"/>
           <w:szCs w:val="18"/>
         </w:rPr>
-        <w:t xml:space="preserve">Nevada Grown Investments </w:t>
-      </w:r>
-      <w:proofErr w:type="gramStart"/>
-      <w:r>
-        <w:rPr>
-          <w:color w:val="666666"/>
-          <w:sz w:val="18"/>
-          <w:szCs w:val="18"/>
-        </w:rPr>
-        <w:t>LLC  |</w:t>
-      </w:r>
-      <w:proofErr w:type="gramEnd"/>
-      <w:r>
-        <w:rPr>
-          <w:color w:val="666666"/>
-          <w:sz w:val="18"/>
-          <w:szCs w:val="18"/>
-        </w:rPr>
-        <w:t xml:space="preserve">  Confidential</w:t>
+        <w:t>Nevada Grown Investments LLC  |  Confidential</w:t>
       </w:r>
     </w:p>
     <w:sectPr>
@@ -1302,6 +1215,7 @@
   <w:style w:type="character" w:default="1" w:styleId="DefaultParagraphFont">
     <w:name w:val="Default Paragraph Font"/>
     <w:uiPriority w:val="1"/>
+    <w:semiHidden/>
     <w:unhideWhenUsed/>
   </w:style>
   <w:style w:type="table" w:default="1" w:styleId="TableNormal">

</xml_diff>